<commit_message>
Add Rongce branding to Word report
</commit_message>
<xml_diff>
--- a/output/融策_券商风整报告_Word版.docx
+++ b/output/融策_券商风整报告_Word版.docx
@@ -2,6 +2,45 @@
 <file path=word/document.xml><?xml version="1.0" encoding="utf-8"?>
 <w:document xmlns:wpc="http://schemas.microsoft.com/office/word/2010/wordprocessingCanvas" xmlns:mo="http://schemas.microsoft.com/office/mac/office/2008/main" xmlns:mc="http://schemas.openxmlformats.org/markup-compatibility/2006" xmlns:mv="urn:schemas-microsoft-com:mac:vml" xmlns:o="urn:schemas-microsoft-com:office:office" xmlns:r="http://schemas.openxmlformats.org/officeDocument/2006/relationships" xmlns:m="http://schemas.openxmlformats.org/officeDocument/2006/math" xmlns:v="urn:schemas-microsoft-com:vml" xmlns:wp14="http://schemas.microsoft.com/office/word/2010/wordprocessingDrawing" xmlns:wp="http://schemas.openxmlformats.org/drawingml/2006/wordprocessingDrawing" xmlns:w10="urn:schemas-microsoft-com:office:word" xmlns:w="http://schemas.openxmlformats.org/wordprocessingml/2006/main" xmlns:w14="http://schemas.microsoft.com/office/word/2010/wordml" xmlns:wpg="http://schemas.microsoft.com/office/word/2010/wordprocessingGroup" xmlns:wpi="http://schemas.microsoft.com/office/word/2010/wordprocessingInk" xmlns:wne="http://schemas.microsoft.com/office/word/2006/wordml" xmlns:wps="http://schemas.microsoft.com/office/word/2010/wordprocessingShape" mc:Ignorable="w14 wp14">
   <w:body>
+    <w:p>
+      <w:pPr>
+        <w:jc w:val="right"/>
+      </w:pPr>
+      <w:r>
+        <w:drawing>
+          <wp:inline xmlns:a="http://schemas.openxmlformats.org/drawingml/2006/main" xmlns:pic="http://schemas.openxmlformats.org/drawingml/2006/picture">
+            <wp:extent cx="720000" cy="722939"/>
+            <wp:docPr id="1" name="Picture 1"/>
+            <wp:cNvGraphicFramePr>
+              <a:graphicFrameLocks noChangeAspect="1"/>
+            </wp:cNvGraphicFramePr>
+            <a:graphic>
+              <a:graphicData uri="http://schemas.openxmlformats.org/drawingml/2006/picture">
+                <pic:pic>
+                  <pic:nvPicPr>
+                    <pic:cNvPr id="0" name="融策logo.png"/>
+                    <pic:cNvPicPr/>
+                  </pic:nvPicPr>
+                  <pic:blipFill>
+                    <a:blip r:embed="rId9"/>
+                    <a:stretch>
+                      <a:fillRect/>
+                    </a:stretch>
+                  </pic:blipFill>
+                  <pic:spPr>
+                    <a:xfrm>
+                      <a:off x="0" y="0"/>
+                      <a:ext cx="720000" cy="722939"/>
+                    </a:xfrm>
+                    <a:prstGeom prst="rect"/>
+                  </pic:spPr>
+                </pic:pic>
+              </a:graphicData>
+            </a:graphic>
+          </wp:inline>
+        </w:drawing>
+      </w:r>
+    </w:p>
     <w:tbl>
       <w:tblPr>
         <w:tblW w:type="auto" w:w="0"/>
@@ -787,6 +826,46 @@
     </w:p>
     <w:p>
       <w:pPr>
+        <w:spacing w:after="200"/>
+        <w:jc w:val="center"/>
+      </w:pPr>
+      <w:r>
+        <w:drawing>
+          <wp:inline xmlns:a="http://schemas.openxmlformats.org/drawingml/2006/main" xmlns:pic="http://schemas.openxmlformats.org/drawingml/2006/picture">
+            <wp:extent cx="5832000" cy="1197512"/>
+            <wp:docPr id="2" name="Picture 2"/>
+            <wp:cNvGraphicFramePr>
+              <a:graphicFrameLocks noChangeAspect="1"/>
+            </wp:cNvGraphicFramePr>
+            <a:graphic>
+              <a:graphicData uri="http://schemas.openxmlformats.org/drawingml/2006/picture">
+                <pic:pic>
+                  <pic:nvPicPr>
+                    <pic:cNvPr id="0" name="融策抬头.jpg"/>
+                    <pic:cNvPicPr/>
+                  </pic:nvPicPr>
+                  <pic:blipFill>
+                    <a:blip r:embed="rId12"/>
+                    <a:stretch>
+                      <a:fillRect/>
+                    </a:stretch>
+                  </pic:blipFill>
+                  <pic:spPr>
+                    <a:xfrm>
+                      <a:off x="0" y="0"/>
+                      <a:ext cx="5832000" cy="1197512"/>
+                    </a:xfrm>
+                    <a:prstGeom prst="rect"/>
+                  </pic:spPr>
+                </pic:pic>
+              </a:graphicData>
+            </a:graphic>
+          </wp:inline>
+        </w:drawing>
+      </w:r>
+    </w:p>
+    <w:p>
+      <w:pPr>
         <w:pStyle w:val="Heading1"/>
       </w:pPr>
       <w:r>
@@ -1002,7 +1081,7 @@
         <w:drawing>
           <wp:inline xmlns:a="http://schemas.openxmlformats.org/drawingml/2006/main" xmlns:pic="http://schemas.openxmlformats.org/drawingml/2006/picture">
             <wp:extent cx="5832000" cy="3283076"/>
-            <wp:docPr id="1" name="Picture 1"/>
+            <wp:docPr id="3" name="Picture 3"/>
             <wp:cNvGraphicFramePr>
               <a:graphicFrameLocks noChangeAspect="1"/>
             </wp:cNvGraphicFramePr>
@@ -1014,7 +1093,7 @@
                     <pic:cNvPicPr/>
                   </pic:nvPicPr>
                   <pic:blipFill>
-                    <a:blip r:embed="rId11"/>
+                    <a:blip r:embed="rId13"/>
                     <a:stretch>
                       <a:fillRect/>
                     </a:stretch>
@@ -2010,7 +2089,7 @@
         <w:drawing>
           <wp:inline xmlns:a="http://schemas.openxmlformats.org/drawingml/2006/main" xmlns:pic="http://schemas.openxmlformats.org/drawingml/2006/picture">
             <wp:extent cx="5832000" cy="3283076"/>
-            <wp:docPr id="2" name="Picture 2"/>
+            <wp:docPr id="4" name="Picture 4"/>
             <wp:cNvGraphicFramePr>
               <a:graphicFrameLocks noChangeAspect="1"/>
             </wp:cNvGraphicFramePr>
@@ -2022,7 +2101,7 @@
                     <pic:cNvPicPr/>
                   </pic:nvPicPr>
                   <pic:blipFill>
-                    <a:blip r:embed="rId12"/>
+                    <a:blip r:embed="rId14"/>
                     <a:stretch>
                       <a:fillRect/>
                     </a:stretch>
@@ -2474,8 +2553,8 @@
       </w:r>
     </w:p>
     <w:sectPr>
-      <w:headerReference w:type="default" r:id="rId9"/>
-      <w:footerReference w:type="default" r:id="rId10"/>
+      <w:headerReference w:type="default" r:id="rId10"/>
+      <w:footerReference w:type="default" r:id="rId11"/>
       <w:pgSz w:w="11906" w:h="16838"/>
       <w:pgMar w:top="1247" w:right="1361" w:bottom="1134" w:left="1361" w:header="720" w:footer="720" w:gutter="0"/>
       <w:cols w:space="720"/>
@@ -2512,6 +2591,49 @@
       <w:pStyle w:val="Header"/>
       <w:jc w:val="right"/>
     </w:pPr>
+    <w:r>
+      <w:drawing>
+        <wp:inline xmlns:a="http://schemas.openxmlformats.org/drawingml/2006/main" xmlns:pic="http://schemas.openxmlformats.org/drawingml/2006/picture">
+          <wp:extent cx="198000" cy="198808"/>
+          <wp:docPr id="1" name="Picture 1"/>
+          <wp:cNvGraphicFramePr>
+            <a:graphicFrameLocks noChangeAspect="1"/>
+          </wp:cNvGraphicFramePr>
+          <a:graphic>
+            <a:graphicData uri="http://schemas.openxmlformats.org/drawingml/2006/picture">
+              <pic:pic>
+                <pic:nvPicPr>
+                  <pic:cNvPr id="0" name="融策logo.png"/>
+                  <pic:cNvPicPr/>
+                </pic:nvPicPr>
+                <pic:blipFill>
+                  <a:blip r:embed="rId1"/>
+                  <a:stretch>
+                    <a:fillRect/>
+                  </a:stretch>
+                </pic:blipFill>
+                <pic:spPr>
+                  <a:xfrm>
+                    <a:off x="0" y="0"/>
+                    <a:ext cx="198000" cy="198808"/>
+                  </a:xfrm>
+                  <a:prstGeom prst="rect"/>
+                </pic:spPr>
+              </pic:pic>
+            </a:graphicData>
+          </a:graphic>
+        </wp:inline>
+      </w:drawing>
+    </w:r>
+    <w:r>
+      <w:rPr>
+        <w:rFonts w:ascii="Microsoft YaHei" w:hAnsi="Microsoft YaHei" w:eastAsia="Microsoft YaHei"/>
+        <w:b w:val="0"/>
+        <w:color w:val="8793A0"/>
+        <w:sz w:val="16"/>
+      </w:rPr>
+      <w:t xml:space="preserve">  </w:t>
+    </w:r>
     <w:r>
       <w:rPr>
         <w:rFonts w:ascii="Microsoft YaHei" w:hAnsi="Microsoft YaHei" w:eastAsia="Microsoft YaHei"/>

</xml_diff>